<commit_message>
Add statistical evidence generation script and report
- Introduced `scripts/statistical_evidence.py` to generate uncertainty and exploratory pairwise statistics for benchmark artifacts.
- Created `experiments/statistical_evidence_2026-05-17.json` to store generated statistical data.
- Updated `draft.md` to include references to the new statistical evidence report and its findings.
- Added relevant details to the manuscript regarding the low-data competitiveness of quantum models.
- Updated the manuscript's table of contents to include the new statistical evidence report.
</commit_message>
<xml_diff>
--- a/docs/PUBLICATION_STRATEGY_2026-03-22.docx
+++ b/docs/PUBLICATION_STRATEGY_2026-03-22.docx
@@ -1062,7 +1062,16 @@
         </w:numPr>
       </w:pPr>
       <w:r>
-        <w:t xml:space="preserve">confidence intervals or significance tests</w:t>
+        <w:t xml:space="preserve">formal inferential power beyond the May 17, 2026 confidence-interval and exploratory Welch report; most multi-seed groups still have only</w:t>
+      </w:r>
+      <w:r>
+        <w:t xml:space="preserve"> </w:t>
+      </w:r>
+      <w:r>
+        <w:rPr>
+          <w:rStyle w:val="VerbatimChar"/>
+        </w:rPr>
+        <w:t xml:space="preserve">n=3</w:t>
       </w:r>
     </w:p>
     <w:p>
@@ -2173,7 +2182,7 @@
         </w:numPr>
       </w:pPr>
       <w:r>
-        <w:t xml:space="preserve">formal confidence intervals or significance tests if the target venue requires stronger statistical reporting</w:t>
+        <w:t xml:space="preserve">stronger statistical reporting if the target venue requires more than the May 17, 2026 descriptive confidence-interval and exploratory Welch report</w:t>
       </w:r>
     </w:p>
     <w:p>

</xml_diff>